<commit_message>
chore(rh): attestations — réintègre les modèles MED/Abandon arrangés par Layla
Mise en page revue dans Word, champs {…} réparés sans toucher la mise en
forme (fusion ciblée des seuls placeholders coupés par Word).

Co-Authored-By: Claude Opus 4.8 (1M context) <noreply@anthropic.com>
</commit_message>
<xml_diff>
--- a/public/hr_modeles/abandon_poste_template.docx
+++ b/public/hr_modeles/abandon_poste_template.docx
@@ -132,23 +132,25 @@
           <w:sz w:val="32"/>
           <w:szCs w:val="32"/>
         </w:rPr>
-        <w:t>Monsieur l’Inspecteur,</w:t>
-      </w:r>
-    </w:p>
-    <w:p>
-      <w:pPr>
+        <w:t>Monsieur l’</w:t>
+      </w:r>
+      <w:proofErr w:type="spellStart"/>
+      <w:r>
         <w:rPr>
           <w:sz w:val="32"/>
           <w:szCs w:val="32"/>
         </w:rPr>
-      </w:pPr>
-      <w:r>
+        <w:t>Inspecteur,</w:t>
+      </w:r>
+      <w:proofErr w:type="spellEnd"/>
+    </w:p>
+    <w:p>
+      <w:pPr>
         <w:rPr>
           <w:sz w:val="32"/>
           <w:szCs w:val="32"/>
         </w:rPr>
-        <w:t xml:space="preserve">Nous avons l’honneur de vous adresser, ci-joint, une copie de la notification d’abandon de travail émise à l’encontre de {NOM}, employée au sein de notre établissement L&amp;N Gourmet.</w:t>
-      </w:r>
+      </w:pPr>
     </w:p>
     <w:p>
       <w:pPr>
@@ -157,6 +159,97 @@
           <w:szCs w:val="32"/>
         </w:rPr>
       </w:pPr>
+      <w:r>
+        <w:rPr>
+          <w:sz w:val="28"/>
+          <w:szCs w:val="28"/>
+        </w:rPr>
+        <w:t>Nous avons l’honneur de vous adresser, ci-joint, une copie de la notification d’abandon de travail émise à l’encontre de {NOM}, employée au sein de notre établissement L&amp;N Gourmet.</w:t>
+      </w:r>
+    </w:p>
+    <w:p>
+      <w:pPr>
+        <w:rPr>
+          <w:sz w:val="28"/>
+          <w:szCs w:val="28"/>
+        </w:rPr>
+      </w:pPr>
+    </w:p>
+    <w:p>
+      <w:pPr>
+        <w:rPr>
+          <w:sz w:val="28"/>
+          <w:szCs w:val="28"/>
+        </w:rPr>
+      </w:pPr>
+      <w:r>
+        <w:rPr>
+          <w:sz w:val="28"/>
+          <w:szCs w:val="28"/>
+        </w:rPr>
+        <w:t>Nous restons à votre disposition pour tout renseignement complémentaire ou pour toute éventuelle convocation relative à ce dossier.</w:t>
+      </w:r>
+    </w:p>
+    <w:p>
+      <w:pPr>
+        <w:rPr>
+          <w:sz w:val="28"/>
+          <w:szCs w:val="28"/>
+        </w:rPr>
+      </w:pPr>
+    </w:p>
+    <w:p>
+      <w:pPr>
+        <w:rPr>
+          <w:sz w:val="28"/>
+          <w:szCs w:val="28"/>
+        </w:rPr>
+      </w:pPr>
+      <w:r>
+        <w:rPr>
+          <w:sz w:val="28"/>
+          <w:szCs w:val="28"/>
+        </w:rPr>
+        <w:t>Nous vous prions d’agréer, Monsieur l’Inspecteur, l’expression de nos salutations distinguées.</w:t>
+      </w:r>
+    </w:p>
+    <w:p>
+      <w:pPr>
+        <w:rPr>
+          <w:sz w:val="28"/>
+          <w:szCs w:val="28"/>
+        </w:rPr>
+      </w:pPr>
+    </w:p>
+    <w:p>
+      <w:pPr>
+        <w:rPr>
+          <w:sz w:val="28"/>
+          <w:szCs w:val="28"/>
+        </w:rPr>
+      </w:pPr>
+    </w:p>
+    <w:p>
+      <w:pPr>
+        <w:rPr>
+          <w:sz w:val="28"/>
+          <w:szCs w:val="28"/>
+        </w:rPr>
+      </w:pPr>
+      <w:r>
+        <w:rPr>
+          <w:sz w:val="28"/>
+          <w:szCs w:val="28"/>
+        </w:rPr>
+        <w:t>Fait à Rabat, le {DATE_REDACTION}</w:t>
+      </w:r>
+      <w:r>
+        <w:rPr>
+          <w:sz w:val="28"/>
+          <w:szCs w:val="28"/>
+        </w:rPr>
+        <w:br/>
+      </w:r>
     </w:p>
     <w:p>
       <w:pPr>
@@ -170,68 +263,7 @@
           <w:sz w:val="32"/>
           <w:szCs w:val="32"/>
         </w:rPr>
-        <w:t>Nous restons à votre disposition pour tout renseignement complémentaire ou pour toute éventuelle convocation relative à ce dossier.</w:t>
-      </w:r>
-    </w:p>
-    <w:p>
-      <w:pPr>
-        <w:rPr>
-          <w:sz w:val="32"/>
-          <w:szCs w:val="32"/>
-        </w:rPr>
-      </w:pPr>
-    </w:p>
-    <w:p>
-      <w:pPr>
-        <w:rPr>
-          <w:sz w:val="32"/>
-          <w:szCs w:val="32"/>
-        </w:rPr>
-      </w:pPr>
-      <w:r>
-        <w:rPr>
-          <w:sz w:val="32"/>
-          <w:szCs w:val="32"/>
-        </w:rPr>
-        <w:t>N</w:t>
-      </w:r>
-      <w:r>
-        <w:rPr>
-          <w:sz w:val="32"/>
-          <w:szCs w:val="32"/>
-        </w:rPr>
-        <w:t>ous vous prions d’agréer, Monsieur l’Inspecteur, l’expression de nos salutations distinguées.</w:t>
-      </w:r>
-    </w:p>
-    <w:p>
-      <w:pPr>
-        <w:rPr>
-          <w:sz w:val="32"/>
-          <w:szCs w:val="32"/>
-        </w:rPr>
-      </w:pPr>
-    </w:p>
-    <w:p>
-      <w:pPr>
-        <w:rPr>
-          <w:sz w:val="32"/>
-          <w:szCs w:val="32"/>
-        </w:rPr>
-      </w:pPr>
-    </w:p>
-    <w:p>
-      <w:pPr>
-        <w:rPr>
-          <w:sz w:val="32"/>
-          <w:szCs w:val="32"/>
-        </w:rPr>
-      </w:pPr>
-      <w:r>
-        <w:rPr>
-          <w:sz w:val="32"/>
-          <w:szCs w:val="32"/>
-        </w:rPr>
-        <w:t xml:space="preserve">Fait à Rabat, le {DATE_REDACTION}Pour la société L&amp;N GourmetDirectrice General</w:t>
+        <w:t>Directrice General</w:t>
       </w:r>
     </w:p>
     <w:p/>
@@ -265,7 +297,10 @@
           <w:szCs w:val="36"/>
         </w:rPr>
       </w:pPr>
-      <w:r>
+    </w:p>
+    <w:p>
+      <w:pPr>
+        <w:pStyle w:val="NormalWeb"/>
         <w:rPr>
           <w:b/>
           <w:bCs/>
@@ -273,175 +308,8 @@
           <w:sz w:val="36"/>
           <w:szCs w:val="36"/>
         </w:rPr>
-        <w:t xml:space="preserve">À l’attention de {NOM}, {ADRESSE}</w:t>
-      </w:r>
-    </w:p>
-    <w:p>
-      <w:pPr>
-        <w:pStyle w:val="NormalWeb"/>
-        <w:rPr>
-          <w:rStyle w:val="lev"/>
-          <w:color w:val="000000"/>
-          <w:sz w:val="28"/>
-          <w:szCs w:val="28"/>
-        </w:rPr>
-      </w:pPr>
-    </w:p>
-    <w:p>
-      <w:pPr>
-        <w:pStyle w:val="NormalWeb"/>
-        <w:rPr>
-          <w:rStyle w:val="lev"/>
-          <w:color w:val="000000"/>
-          <w:sz w:val="28"/>
-          <w:szCs w:val="28"/>
-        </w:rPr>
-      </w:pPr>
-      <w:r>
-        <w:rPr>
-          <w:rStyle w:val="lev"/>
-          <w:color w:val="000000"/>
-          <w:sz w:val="28"/>
-          <w:szCs w:val="28"/>
-        </w:rPr>
-        <w:t>Objet</w:t>
-      </w:r>
-      <w:r>
-        <w:rPr>
-          <w:rStyle w:val="lev"/>
-          <w:color w:val="000000"/>
-          <w:sz w:val="28"/>
-          <w:szCs w:val="28"/>
-        </w:rPr>
-        <w:t> :</w:t>
-      </w:r>
-      <w:r>
-        <w:rPr>
-          <w:rStyle w:val="lev"/>
-          <w:color w:val="000000"/>
-          <w:sz w:val="28"/>
-          <w:szCs w:val="28"/>
-        </w:rPr>
-        <w:t xml:space="preserve"> Notification d</w:t>
-      </w:r>
-      <w:r>
-        <w:rPr>
-          <w:rStyle w:val="lev"/>
-          <w:color w:val="000000"/>
-          <w:sz w:val="28"/>
-          <w:szCs w:val="28"/>
-        </w:rPr>
-        <w:t>’</w:t>
-      </w:r>
-      <w:r>
-        <w:rPr>
-          <w:rStyle w:val="lev"/>
-          <w:color w:val="000000"/>
-          <w:sz w:val="28"/>
-          <w:szCs w:val="28"/>
-        </w:rPr>
-        <w:t>abandon de travail.</w:t>
-      </w:r>
-    </w:p>
-    <w:p>
-      <w:pPr>
-        <w:pStyle w:val="NormalWeb"/>
-        <w:rPr>
-          <w:color w:val="000000"/>
-          <w:sz w:val="28"/>
-          <w:szCs w:val="28"/>
-        </w:rPr>
-      </w:pPr>
-      <w:r>
-        <w:rPr>
-          <w:color w:val="000000"/>
-          <w:sz w:val="28"/>
-          <w:szCs w:val="28"/>
-        </w:rPr>
-        <w:t xml:space="preserve">{NOM},</w:t>
-      </w:r>
-    </w:p>
-    <w:p>
-      <w:pPr>
-        <w:pStyle w:val="NormalWeb"/>
-        <w:rPr>
-          <w:color w:val="000000"/>
-          <w:sz w:val="28"/>
-          <w:szCs w:val="28"/>
-        </w:rPr>
-      </w:pPr>
-      <w:r>
-        <w:rPr>
-          <w:color w:val="000000"/>
-          <w:sz w:val="28"/>
-          <w:szCs w:val="28"/>
-        </w:rPr>
-        <w:t xml:space="preserve">C’est avec un grand regret que nous constatons que vous avez quitté votre poste depuis le {DATE_DEPART}. Restant sans nouvelles de votre part depuis la date citée en dessus et ce malgré notre mise en demeure du {DATE_MED}, nous vous notifions donc que nous prenons acte de votre abandon de poste définitif.</w:t>
-      </w:r>
-    </w:p>
-    <w:p>
-      <w:pPr>
-        <w:pStyle w:val="NormalWeb"/>
-        <w:rPr>
-          <w:color w:val="000000"/>
-          <w:sz w:val="28"/>
-          <w:szCs w:val="28"/>
-        </w:rPr>
-      </w:pPr>
-      <w:r>
-        <w:rPr>
-          <w:color w:val="000000"/>
-          <w:sz w:val="28"/>
-          <w:szCs w:val="28"/>
-        </w:rPr>
-        <w:t>Nous vous prions de prendre contact avec l</w:t>
-      </w:r>
-      <w:r>
-        <w:rPr>
-          <w:color w:val="000000"/>
-          <w:sz w:val="28"/>
-          <w:szCs w:val="28"/>
-        </w:rPr>
-        <w:t>’</w:t>
-      </w:r>
-      <w:r>
-        <w:rPr>
-          <w:color w:val="000000"/>
-          <w:sz w:val="28"/>
-          <w:szCs w:val="28"/>
-        </w:rPr>
-        <w:t>administrateur pour récupérer votre certificat de travail et votre solde de tout compte</w:t>
-      </w:r>
-      <w:r>
-        <w:rPr>
-          <w:color w:val="000000"/>
-          <w:sz w:val="28"/>
-          <w:szCs w:val="28"/>
-        </w:rPr>
-        <w:t>.</w:t>
-      </w:r>
-    </w:p>
-    <w:p>
-      <w:pPr>
-        <w:pStyle w:val="NormalWeb"/>
-        <w:rPr>
-          <w:color w:val="000000"/>
-          <w:sz w:val="28"/>
-          <w:szCs w:val="28"/>
-        </w:rPr>
-      </w:pPr>
-      <w:r>
-        <w:rPr>
-          <w:color w:val="000000"/>
-          <w:sz w:val="28"/>
-          <w:szCs w:val="28"/>
-        </w:rPr>
-        <w:t xml:space="preserve">Cordialement,Fait à Rabat {DATE_REDACTION}La DirectionN.B. :Une copie de la présente lettre sera transmise à l’Inspection du Travail.</w:t>
-      </w:r>
-    </w:p>
-    <w:p>
-      <w:pPr>
-        <w:pStyle w:val="NormalWeb"/>
+      </w:pPr>
+      <w:r>
         <w:rPr>
           <w:b/>
           <w:bCs/>
@@ -449,8 +317,157 @@
           <w:sz w:val="36"/>
           <w:szCs w:val="36"/>
         </w:rPr>
-      </w:pPr>
-      <w:r>
+        <w:t>À l’attention de {NOM}, {ADRESSE}</w:t>
+      </w:r>
+    </w:p>
+    <w:p>
+      <w:pPr>
+        <w:pStyle w:val="NormalWeb"/>
+        <w:rPr>
+          <w:rStyle w:val="lev"/>
+          <w:color w:val="000000"/>
+          <w:sz w:val="28"/>
+          <w:szCs w:val="28"/>
+        </w:rPr>
+      </w:pPr>
+    </w:p>
+    <w:p>
+      <w:pPr>
+        <w:pStyle w:val="NormalWeb"/>
+        <w:rPr>
+          <w:rStyle w:val="lev"/>
+          <w:color w:val="000000"/>
+          <w:sz w:val="28"/>
+          <w:szCs w:val="28"/>
+        </w:rPr>
+      </w:pPr>
+      <w:r>
+        <w:rPr>
+          <w:rStyle w:val="lev"/>
+          <w:color w:val="000000"/>
+          <w:sz w:val="28"/>
+          <w:szCs w:val="28"/>
+        </w:rPr>
+        <w:t>Objet</w:t>
+      </w:r>
+      <w:r>
+        <w:rPr>
+          <w:rStyle w:val="lev"/>
+          <w:color w:val="000000"/>
+          <w:sz w:val="28"/>
+          <w:szCs w:val="28"/>
+        </w:rPr>
+        <w:t> :</w:t>
+      </w:r>
+      <w:r>
+        <w:rPr>
+          <w:rStyle w:val="lev"/>
+          <w:color w:val="000000"/>
+          <w:sz w:val="28"/>
+          <w:szCs w:val="28"/>
+        </w:rPr>
+        <w:t xml:space="preserve"> Notification d</w:t>
+      </w:r>
+      <w:r>
+        <w:rPr>
+          <w:rStyle w:val="lev"/>
+          <w:color w:val="000000"/>
+          <w:sz w:val="28"/>
+          <w:szCs w:val="28"/>
+        </w:rPr>
+        <w:t>’</w:t>
+      </w:r>
+      <w:r>
+        <w:rPr>
+          <w:rStyle w:val="lev"/>
+          <w:color w:val="000000"/>
+          <w:sz w:val="28"/>
+          <w:szCs w:val="28"/>
+        </w:rPr>
+        <w:t>abandon de travail.</w:t>
+      </w:r>
+    </w:p>
+    <w:p>
+      <w:pPr>
+        <w:pStyle w:val="NormalWeb"/>
+        <w:rPr>
+          <w:color w:val="000000"/>
+          <w:sz w:val="28"/>
+          <w:szCs w:val="28"/>
+        </w:rPr>
+      </w:pPr>
+      <w:r>
+        <w:rPr>
+          <w:color w:val="000000"/>
+          <w:sz w:val="28"/>
+          <w:szCs w:val="28"/>
+        </w:rPr>
+        <w:t>{NOM},</w:t>
+      </w:r>
+    </w:p>
+    <w:p>
+      <w:pPr>
+        <w:pStyle w:val="NormalWeb"/>
+        <w:rPr>
+          <w:color w:val="000000"/>
+          <w:sz w:val="28"/>
+          <w:szCs w:val="28"/>
+        </w:rPr>
+      </w:pPr>
+      <w:r>
+        <w:rPr>
+          <w:color w:val="000000"/>
+          <w:sz w:val="28"/>
+          <w:szCs w:val="28"/>
+        </w:rPr>
+        <w:t>C’est avec un grand regret que nous constatons que vous avez quitté votre poste depuis le {DATE_DEPART}. Restant sans nouvelles de votre part depuis la date citée en dessus et ce malgré notre mise en demeure du {DATE_MED}, nous vous notifions donc que nous prenons acte de votre abandon de poste définitif.</w:t>
+      </w:r>
+    </w:p>
+    <w:p>
+      <w:pPr>
+        <w:pStyle w:val="NormalWeb"/>
+        <w:rPr>
+          <w:color w:val="000000"/>
+          <w:sz w:val="28"/>
+          <w:szCs w:val="28"/>
+        </w:rPr>
+      </w:pPr>
+      <w:r>
+        <w:rPr>
+          <w:color w:val="000000"/>
+          <w:sz w:val="28"/>
+          <w:szCs w:val="28"/>
+        </w:rPr>
+        <w:t>Nous vous prions de prendre contact avec l</w:t>
+      </w:r>
+      <w:r>
+        <w:rPr>
+          <w:color w:val="000000"/>
+          <w:sz w:val="28"/>
+          <w:szCs w:val="28"/>
+        </w:rPr>
+        <w:t>’</w:t>
+      </w:r>
+      <w:r>
+        <w:rPr>
+          <w:color w:val="000000"/>
+          <w:sz w:val="28"/>
+          <w:szCs w:val="28"/>
+        </w:rPr>
+        <w:t>administrateur pour récupérer votre certificat de travail et votre solde de tout compte</w:t>
+      </w:r>
+      <w:r>
+        <w:rPr>
+          <w:color w:val="000000"/>
+          <w:sz w:val="28"/>
+          <w:szCs w:val="28"/>
+        </w:rPr>
+        <w:t>.</w:t>
+      </w:r>
+    </w:p>
+    <w:p>
+      <w:pPr>
+        <w:pStyle w:val="NormalWeb"/>
         <w:rPr>
           <w:b/>
           <w:bCs/>
@@ -458,13 +475,245 @@
           <w:sz w:val="36"/>
           <w:szCs w:val="36"/>
         </w:rPr>
-        <w:t xml:space="preserve">À l’attention de {NOM}, {ADRESSE}</w:t>
+      </w:pPr>
+      <w:r>
+        <w:rPr>
+          <w:color w:val="000000"/>
+          <w:sz w:val="28"/>
+          <w:szCs w:val="28"/>
+        </w:rPr>
+        <w:t>Cordialement,</w:t>
+      </w:r>
+      <w:r>
+        <w:rPr>
+          <w:color w:val="000000"/>
+          <w:sz w:val="28"/>
+          <w:szCs w:val="28"/>
+        </w:rPr>
+        <w:br/>
+      </w:r>
+      <w:r>
+        <w:rPr>
+          <w:color w:val="000000"/>
+          <w:sz w:val="28"/>
+          <w:szCs w:val="28"/>
+        </w:rPr>
+        <w:br/>
+      </w:r>
+      <w:r>
+        <w:rPr>
+          <w:color w:val="000000"/>
+          <w:sz w:val="28"/>
+          <w:szCs w:val="28"/>
+        </w:rPr>
+        <w:br/>
+      </w:r>
+      <w:r>
+        <w:rPr>
+          <w:color w:val="000000"/>
+          <w:sz w:val="28"/>
+          <w:szCs w:val="28"/>
+        </w:rPr>
+        <w:t>Fait à Rabat {DATE_REDACTION}</w:t>
+      </w:r>
+      <w:r>
+        <w:rPr>
+          <w:color w:val="000000"/>
+          <w:sz w:val="28"/>
+          <w:szCs w:val="28"/>
+        </w:rPr>
+        <w:br/>
+      </w:r>
+      <w:r>
+        <w:rPr>
+          <w:color w:val="000000"/>
+          <w:sz w:val="28"/>
+          <w:szCs w:val="28"/>
+        </w:rPr>
+        <w:br/>
+      </w:r>
+      <w:r>
+        <w:rPr>
+          <w:color w:val="000000"/>
+          <w:sz w:val="28"/>
+          <w:szCs w:val="28"/>
+        </w:rPr>
+        <w:br/>
+      </w:r>
+      <w:r>
+        <w:rPr>
+          <w:color w:val="000000"/>
+          <w:sz w:val="28"/>
+          <w:szCs w:val="28"/>
+        </w:rPr>
+        <w:t>La Direction</w:t>
+      </w:r>
+      <w:r>
+        <w:rPr>
+          <w:color w:val="000000"/>
+          <w:sz w:val="28"/>
+          <w:szCs w:val="28"/>
+        </w:rPr>
+        <w:br/>
+      </w:r>
+      <w:r>
+        <w:rPr>
+          <w:color w:val="000000"/>
+          <w:sz w:val="28"/>
+          <w:szCs w:val="28"/>
+        </w:rPr>
+        <w:br/>
+      </w:r>
+      <w:r>
+        <w:rPr>
+          <w:color w:val="000000"/>
+          <w:sz w:val="28"/>
+          <w:szCs w:val="28"/>
+        </w:rPr>
+        <w:br/>
+      </w:r>
+      <w:r>
+        <w:rPr>
+          <w:color w:val="000000"/>
+          <w:sz w:val="28"/>
+          <w:szCs w:val="28"/>
+        </w:rPr>
+        <w:br/>
+      </w:r>
+      <w:r>
+        <w:rPr>
+          <w:color w:val="000000"/>
+          <w:sz w:val="28"/>
+          <w:szCs w:val="28"/>
+        </w:rPr>
+        <w:br/>
+      </w:r>
+      <w:r>
+        <w:rPr>
+          <w:color w:val="000000"/>
+          <w:sz w:val="28"/>
+          <w:szCs w:val="28"/>
+        </w:rPr>
+        <w:br/>
+      </w:r>
+      <w:r>
+        <w:rPr>
+          <w:color w:val="000000"/>
+          <w:sz w:val="28"/>
+          <w:szCs w:val="28"/>
+        </w:rPr>
+        <w:br/>
+      </w:r>
+      <w:r>
+        <w:rPr>
+          <w:color w:val="000000"/>
+          <w:sz w:val="28"/>
+          <w:szCs w:val="28"/>
+        </w:rPr>
+        <w:br/>
+      </w:r>
+      <w:r>
+        <w:rPr>
+          <w:color w:val="000000"/>
+          <w:sz w:val="28"/>
+          <w:szCs w:val="28"/>
+        </w:rPr>
+        <w:t>N.B.</w:t>
+      </w:r>
+      <w:proofErr w:type="gramStart"/>
+      <w:r>
+        <w:rPr>
+          <w:color w:val="000000"/>
+          <w:sz w:val="28"/>
+          <w:szCs w:val="28"/>
+        </w:rPr>
+        <w:t xml:space="preserve"> :Une</w:t>
+      </w:r>
+      <w:proofErr w:type="gramEnd"/>
+      <w:r>
+        <w:rPr>
+          <w:color w:val="000000"/>
+          <w:sz w:val="28"/>
+          <w:szCs w:val="28"/>
+        </w:rPr>
+        <w:t xml:space="preserve"> copie de la présente lettre sera transmise à l’Inspection du Travail.</w:t>
+      </w:r>
+      <w:r>
+        <w:rPr>
+          <w:color w:val="000000"/>
+          <w:sz w:val="28"/>
+          <w:szCs w:val="28"/>
+        </w:rPr>
+        <w:br/>
+      </w:r>
+      <w:r>
+        <w:rPr>
+          <w:color w:val="000000"/>
+          <w:sz w:val="28"/>
+          <w:szCs w:val="28"/>
+        </w:rPr>
+        <w:br/>
+      </w:r>
+      <w:r>
+        <w:rPr>
+          <w:color w:val="000000"/>
+          <w:sz w:val="28"/>
+          <w:szCs w:val="28"/>
+        </w:rPr>
+        <w:br/>
+      </w:r>
+      <w:r>
+        <w:rPr>
+          <w:color w:val="000000"/>
+          <w:sz w:val="28"/>
+          <w:szCs w:val="28"/>
+        </w:rPr>
+        <w:br/>
+      </w:r>
+      <w:r>
+        <w:rPr>
+          <w:color w:val="000000"/>
+          <w:sz w:val="28"/>
+          <w:szCs w:val="28"/>
+        </w:rPr>
+        <w:br/>
+      </w:r>
+      <w:r>
+        <w:rPr>
+          <w:color w:val="000000"/>
+          <w:sz w:val="28"/>
+          <w:szCs w:val="28"/>
+        </w:rPr>
+        <w:lastRenderedPageBreak/>
+        <w:br/>
       </w:r>
     </w:p>
     <w:p>
       <w:pPr>
         <w:pStyle w:val="NormalWeb"/>
         <w:rPr>
+          <w:b/>
+          <w:bCs/>
+          <w:color w:val="000000"/>
+          <w:sz w:val="36"/>
+          <w:szCs w:val="36"/>
+        </w:rPr>
+      </w:pPr>
+      <w:r>
+        <w:rPr>
+          <w:b/>
+          <w:bCs/>
+          <w:color w:val="000000"/>
+          <w:sz w:val="36"/>
+          <w:szCs w:val="36"/>
+        </w:rPr>
+        <w:t>À l’attention de {NOM}, {ADRESSE}</w:t>
+      </w:r>
+    </w:p>
+    <w:p>
+      <w:pPr>
+        <w:pStyle w:val="NormalWeb"/>
+        <w:rPr>
           <w:rStyle w:val="lev"/>
           <w:color w:val="000000"/>
           <w:sz w:val="28"/>
@@ -543,7 +792,7 @@
           <w:sz w:val="28"/>
           <w:szCs w:val="28"/>
         </w:rPr>
-        <w:t xml:space="preserve">{NOM},</w:t>
+        <w:t>{NOM},</w:t>
       </w:r>
     </w:p>
     <w:p>
@@ -561,7 +810,7 @@
           <w:sz w:val="28"/>
           <w:szCs w:val="28"/>
         </w:rPr>
-        <w:t xml:space="preserve">C’est avec un grand regret que nous constatons que vous avez quitté votre poste depuis le {DATE_DEPART}. Restant sans nouvelles de votre part depuis la date citée en dessus et ce malgré notre mise en demeure du {DATE_MED}, nous vous notifions donc que nous prenons acte de votre abandon de poste définitif.</w:t>
+        <w:t>C’est avec un grand regret que nous constatons que vous avez quitté votre poste depuis le {DATE_DEPART}. Restant sans nouvelles de votre part depuis la date citée en dessus et ce malgré notre mise en demeure du {DATE_MED}, nous vous notifions donc que nous prenons acte de votre abandon de poste définitif.</w:t>
       </w:r>
     </w:p>
     <w:p>
@@ -609,22 +858,131 @@
     <w:p>
       <w:pPr>
         <w:pStyle w:val="NormalWeb"/>
-        <w:rPr>
-          <w:color w:val="000000"/>
-          <w:sz w:val="28"/>
-          <w:szCs w:val="28"/>
-        </w:rPr>
-      </w:pPr>
-      <w:r>
-        <w:rPr>
-          <w:color w:val="000000"/>
-          <w:sz w:val="28"/>
-          <w:szCs w:val="28"/>
-        </w:rPr>
-        <w:t xml:space="preserve">Cordialement,Fait à Rabat {DATE_REDACTION}La DirectionN.B. :Une copie de la présente lettre sera transmise à l’Inspection du Travail</w:t>
-      </w:r>
-    </w:p>
-    <w:p/>
+      </w:pPr>
+      <w:r>
+        <w:rPr>
+          <w:color w:val="000000"/>
+          <w:sz w:val="28"/>
+          <w:szCs w:val="28"/>
+        </w:rPr>
+        <w:t>Cordialement,</w:t>
+      </w:r>
+      <w:r>
+        <w:rPr>
+          <w:color w:val="000000"/>
+          <w:sz w:val="28"/>
+          <w:szCs w:val="28"/>
+        </w:rPr>
+        <w:br/>
+      </w:r>
+      <w:r>
+        <w:rPr>
+          <w:color w:val="000000"/>
+          <w:sz w:val="28"/>
+          <w:szCs w:val="28"/>
+        </w:rPr>
+        <w:br/>
+      </w:r>
+      <w:r>
+        <w:rPr>
+          <w:color w:val="000000"/>
+          <w:sz w:val="28"/>
+          <w:szCs w:val="28"/>
+        </w:rPr>
+        <w:br/>
+        <w:t>Fait à Rabat {DATE_REDACTION}</w:t>
+      </w:r>
+      <w:r>
+        <w:rPr>
+          <w:color w:val="000000"/>
+          <w:sz w:val="28"/>
+          <w:szCs w:val="28"/>
+        </w:rPr>
+        <w:br/>
+      </w:r>
+      <w:r>
+        <w:rPr>
+          <w:color w:val="000000"/>
+          <w:sz w:val="28"/>
+          <w:szCs w:val="28"/>
+        </w:rPr>
+        <w:br/>
+      </w:r>
+      <w:r>
+        <w:rPr>
+          <w:color w:val="000000"/>
+          <w:sz w:val="28"/>
+          <w:szCs w:val="28"/>
+        </w:rPr>
+        <w:br/>
+        <w:t>La Direction</w:t>
+      </w:r>
+      <w:r>
+        <w:rPr>
+          <w:color w:val="000000"/>
+          <w:sz w:val="28"/>
+          <w:szCs w:val="28"/>
+        </w:rPr>
+        <w:br/>
+      </w:r>
+      <w:r>
+        <w:rPr>
+          <w:color w:val="000000"/>
+          <w:sz w:val="28"/>
+          <w:szCs w:val="28"/>
+        </w:rPr>
+        <w:br/>
+      </w:r>
+      <w:r>
+        <w:rPr>
+          <w:color w:val="000000"/>
+          <w:sz w:val="28"/>
+          <w:szCs w:val="28"/>
+        </w:rPr>
+        <w:br/>
+      </w:r>
+      <w:r>
+        <w:rPr>
+          <w:color w:val="000000"/>
+          <w:sz w:val="28"/>
+          <w:szCs w:val="28"/>
+        </w:rPr>
+        <w:br/>
+      </w:r>
+      <w:r>
+        <w:rPr>
+          <w:color w:val="000000"/>
+          <w:sz w:val="28"/>
+          <w:szCs w:val="28"/>
+        </w:rPr>
+        <w:br/>
+      </w:r>
+      <w:r>
+        <w:rPr>
+          <w:color w:val="000000"/>
+          <w:sz w:val="28"/>
+          <w:szCs w:val="28"/>
+        </w:rPr>
+        <w:br/>
+      </w:r>
+      <w:r>
+        <w:rPr>
+          <w:color w:val="000000"/>
+          <w:sz w:val="28"/>
+          <w:szCs w:val="28"/>
+        </w:rPr>
+        <w:br/>
+      </w:r>
+      <w:r>
+        <w:rPr>
+          <w:color w:val="000000"/>
+          <w:sz w:val="28"/>
+          <w:szCs w:val="28"/>
+        </w:rPr>
+        <w:br/>
+        <w:t>N.B. :Une copie de la présente lettre sera transmise à l’Inspection du Travail.</w:t>
+      </w:r>
+    </w:p>
     <w:sectPr>
       <w:headerReference w:type="even" r:id="rId6"/>
       <w:headerReference w:type="default" r:id="rId7"/>
@@ -1363,6 +1721,7 @@
   <w:style w:type="character" w:default="1" w:styleId="Policepardfaut">
     <w:name w:val="Default Paragraph Font"/>
     <w:uiPriority w:val="1"/>
+    <w:semiHidden/>
     <w:unhideWhenUsed/>
   </w:style>
   <w:style w:type="table" w:default="1" w:styleId="TableauNormal">

</xml_diff>